<commit_message>
Update fitur Dokumen S-12 dan S-13
- Menambahkan dukungan file SPRINSITA pada S-12 dan S-13
- Menambahkan validasi frontend dan backend terkait SPRINSITA
- Memperbaiki pengisian dan pengosongan tanggal SP Penyidikan dan SPDP
- Menyesuaikan generate DOCX dan data penyitaan pada S-13
- Memperbaiki validasi dan pengelolaan data BAP serta barang sitaan
- Melakukan perbaikan UI dan behavior pada form S-12/S-13
</commit_message>
<xml_diff>
--- a/public/word-template/surat_laporan_mendapatkan_persetujuan_penyitaan.docx
+++ b/public/word-template/surat_laporan_mendapatkan_persetujuan_penyitaan.docx
@@ -74,7 +74,7 @@
                       <w:lang w:val="id-ID"/>
                     </w:rPr>
                     <w:drawing>
-                      <wp:inline distT="0" distB="0" distL="0" distR="0" wp14:anchorId="1D461AF8" wp14:editId="7284B94E">
+                      <wp:inline distT="0" distB="0" distL="0" distR="0" wp14:anchorId="1D461AF8" wp14:editId="6D628312">
                         <wp:extent cx="738127" cy="690404"/>
                         <wp:effectExtent l="0" t="0" r="5080" b="0"/>
                         <wp:docPr id="6" name="Picture 6"/>
@@ -3416,27 +3416,7 @@
                 <w:szCs w:val="24"/>
                 <w:lang w:val="id-ID"/>
               </w:rPr>
-              <w:t xml:space="preserve"> </w:t>
-            </w:r>
-            <w:r>
-              <w:rPr>
-                <w:rFonts w:ascii="Arial Narrow" w:hAnsi="Arial Narrow" w:cs="Arial"/>
-                <w:color w:val="000000"/>
-                <w:sz w:val="24"/>
-                <w:szCs w:val="24"/>
-                <w:lang w:val="id-ID"/>
-              </w:rPr>
-              <w:t>+</w:t>
-            </w:r>
-            <w:r>
-              <w:rPr>
-                <w:rFonts w:ascii="Arial Narrow" w:hAnsi="Arial Narrow" w:cs="Arial"/>
-                <w:color w:val="000000"/>
-                <w:sz w:val="24"/>
-                <w:szCs w:val="24"/>
-                <w:lang w:val="id-ID"/>
-              </w:rPr>
-              <w:t>${investigatorPhoneNumber}.</w:t>
+              <w:t xml:space="preserve"> ${investigatorPhoneNumber}.</w:t>
             </w:r>
           </w:p>
         </w:tc>

</xml_diff>